<commit_message>
Fix Grand Total to use combined CAPEX+OPEX, clean up OPEX table layout, and harden NEV benefit extraction
- compute_cost_totals: Grand Total now always uses total_cost (CAPEX+OPEX)
  with 5% contingency instead of CAPEX alone, fixing both the docx Grand
  Total figure and the Approving Authority tier it feeds into.
- Rebuild the OPEX section of the itemized cost table in the AOR template
  to match the CAPEX section's clean 4-column layout, removing leftover
  blank columns from the old 7-column grid.
- Extraction prompt now distinguishes benefit/time-savings figures from
  manpower cost-capitalisation tables, so NEV benefit fields no longer
  inconsistently pick up cost data as if it were a benefit.
</commit_message>
<xml_diff>
--- a/templates/Sample AOR Template.docx
+++ b/templates/Sample AOR Template.docx
@@ -3413,7 +3413,7 @@
     </w:p>
     <w:tbl>
       <w:tblPr>
-        <w:tblW w:w="3535" w:type="pct"/>
+        <w:tblW w:w="5000" w:type="pct"/>
         <w:tblBorders>
           <w:top w:val="single" w:sz="4" w:space="0" w:color="auto"/>
           <w:left w:val="single" w:sz="4" w:space="0" w:color="auto"/>
@@ -3425,23 +3425,25 @@
         <w:tblLook w:val="04A0" w:firstRow="1" w:lastRow="0" w:firstColumn="1" w:lastColumn="0" w:noHBand="0" w:noVBand="1"/>
       </w:tblPr>
       <w:tblGrid>
-        <w:gridCol w:w="353"/>
-        <w:gridCol w:w="1768"/>
-        <w:gridCol w:w="40"/>
-        <w:gridCol w:w="1238"/>
-        <w:gridCol w:w="2965"/>
-        <w:gridCol w:w="10"/>
+        <w:gridCol w:w="617"/>
+        <w:gridCol w:w="1646"/>
+        <w:gridCol w:w="1134"/>
+        <w:gridCol w:w="4112"/>
       </w:tblGrid>
       <w:tr>
         <w:trPr>
-          <w:gridAfter w:val="1"/>
-          <w:wAfter w:w="9" w:type="pct"/>
           <w:trHeight w:val="801"/>
         </w:trPr>
         <w:tc>
           <w:tcPr>
-            <w:tcW w:w="4991" w:type="pct"/>
-            <w:gridSpan w:val="5"/>
+            <w:tcW w:w="5000" w:type="pct"/>
+            <w:gridSpan w:val="4"/>
+            <w:tcBorders>
+              <w:top w:val="single" w:sz="4" w:space="0" w:color="auto"/>
+              <w:left w:val="single" w:sz="4" w:space="0" w:color="auto"/>
+              <w:bottom w:val="single" w:sz="4" w:space="0" w:color="auto"/>
+              <w:right w:val="single" w:sz="4" w:space="0" w:color="auto"/>
+            </w:tcBorders>
             <w:shd w:val="clear" w:color="000000" w:fill="BFBFBF"/>
             <w:vAlign w:val="center"/>
             <w:hideMark/>
@@ -3470,7 +3472,6 @@
                 <w:szCs w:val="24"/>
                 <w:lang w:eastAsia="en-SG"/>
               </w:rPr>
-              <w:lastRenderedPageBreak/>
               <w:t>OPEX (5 years) </w:t>
             </w:r>
           </w:p>
@@ -3478,14 +3479,19 @@
       </w:tr>
       <w:tr>
         <w:trPr>
-          <w:gridAfter w:val="1"/>
-          <w:wAfter w:w="9" w:type="pct"/>
           <w:trHeight w:val="1401"/>
         </w:trPr>
         <w:tc>
           <w:tcPr>
-            <w:tcW w:w="277" w:type="pct"/>
+            <w:tcW w:w="411" w:type="pct"/>
+            <w:tcBorders>
+              <w:top w:val="single" w:sz="4" w:space="0" w:color="auto"/>
+              <w:left w:val="single" w:sz="4" w:space="0" w:color="auto"/>
+              <w:bottom w:val="single" w:sz="4" w:space="0" w:color="auto"/>
+              <w:right w:val="single" w:sz="4" w:space="0" w:color="auto"/>
+            </w:tcBorders>
             <w:vAlign w:val="center"/>
+            <w:hideMark/>
           </w:tcPr>
           <w:p>
             <w:pPr>
@@ -3513,8 +3519,13 @@
         </w:tc>
         <w:tc>
           <w:tcPr>
-            <w:tcW w:w="1418" w:type="pct"/>
-            <w:gridSpan w:val="2"/>
+            <w:tcW w:w="1096" w:type="pct"/>
+            <w:tcBorders>
+              <w:top w:val="single" w:sz="4" w:space="0" w:color="auto"/>
+              <w:left w:val="nil"/>
+              <w:bottom w:val="single" w:sz="4" w:space="0" w:color="auto"/>
+              <w:right w:val="single" w:sz="4" w:space="0" w:color="auto"/>
+            </w:tcBorders>
             <w:vAlign w:val="center"/>
           </w:tcPr>
           <w:p>
@@ -3532,7 +3543,13 @@
         </w:tc>
         <w:tc>
           <w:tcPr>
-            <w:tcW w:w="970" w:type="pct"/>
+            <w:tcW w:w="755" w:type="pct"/>
+            <w:tcBorders>
+              <w:top w:val="single" w:sz="4" w:space="0" w:color="auto"/>
+              <w:left w:val="nil"/>
+              <w:bottom w:val="single" w:sz="4" w:space="0" w:color="auto"/>
+              <w:right w:val="single" w:sz="4" w:space="0" w:color="auto"/>
+            </w:tcBorders>
             <w:vAlign w:val="center"/>
           </w:tcPr>
           <w:p>
@@ -3552,7 +3569,13 @@
         </w:tc>
         <w:tc>
           <w:tcPr>
-            <w:tcW w:w="2326" w:type="pct"/>
+            <w:tcW w:w="2738" w:type="pct"/>
+            <w:tcBorders>
+              <w:top w:val="single" w:sz="4" w:space="0" w:color="auto"/>
+              <w:left w:val="nil"/>
+              <w:bottom w:val="single" w:sz="4" w:space="0" w:color="auto"/>
+              <w:right w:val="single" w:sz="4" w:space="0" w:color="auto"/>
+            </w:tcBorders>
             <w:vAlign w:val="center"/>
           </w:tcPr>
           <w:p>
@@ -3571,14 +3594,19 @@
       </w:tr>
       <w:tr>
         <w:trPr>
-          <w:gridAfter w:val="1"/>
-          <w:wAfter w:w="9" w:type="pct"/>
           <w:trHeight w:val="1401"/>
         </w:trPr>
         <w:tc>
           <w:tcPr>
-            <w:tcW w:w="277" w:type="pct"/>
+            <w:tcW w:w="411" w:type="pct"/>
+            <w:tcBorders>
+              <w:top w:val="nil"/>
+              <w:left w:val="single" w:sz="4" w:space="0" w:color="auto"/>
+              <w:bottom w:val="single" w:sz="4" w:space="0" w:color="auto"/>
+              <w:right w:val="single" w:sz="4" w:space="0" w:color="auto"/>
+            </w:tcBorders>
             <w:vAlign w:val="center"/>
+            <w:hideMark/>
           </w:tcPr>
           <w:p>
             <w:pPr>
@@ -3606,8 +3634,13 @@
         </w:tc>
         <w:tc>
           <w:tcPr>
-            <w:tcW w:w="1418" w:type="pct"/>
-            <w:gridSpan w:val="2"/>
+            <w:tcW w:w="1096" w:type="pct"/>
+            <w:tcBorders>
+              <w:top w:val="nil"/>
+              <w:left w:val="nil"/>
+              <w:bottom w:val="single" w:sz="4" w:space="0" w:color="auto"/>
+              <w:right w:val="single" w:sz="4" w:space="0" w:color="auto"/>
+            </w:tcBorders>
             <w:vAlign w:val="center"/>
           </w:tcPr>
           <w:p>
@@ -3625,7 +3658,13 @@
         </w:tc>
         <w:tc>
           <w:tcPr>
-            <w:tcW w:w="970" w:type="pct"/>
+            <w:tcW w:w="755" w:type="pct"/>
+            <w:tcBorders>
+              <w:top w:val="nil"/>
+              <w:left w:val="nil"/>
+              <w:bottom w:val="single" w:sz="4" w:space="0" w:color="auto"/>
+              <w:right w:val="single" w:sz="4" w:space="0" w:color="auto"/>
+            </w:tcBorders>
             <w:vAlign w:val="center"/>
           </w:tcPr>
           <w:p>
@@ -3645,7 +3684,13 @@
         </w:tc>
         <w:tc>
           <w:tcPr>
-            <w:tcW w:w="2326" w:type="pct"/>
+            <w:tcW w:w="2738" w:type="pct"/>
+            <w:tcBorders>
+              <w:top w:val="nil"/>
+              <w:left w:val="nil"/>
+              <w:bottom w:val="single" w:sz="4" w:space="0" w:color="auto"/>
+              <w:right w:val="single" w:sz="4" w:space="0" w:color="auto"/>
+            </w:tcBorders>
             <w:vAlign w:val="center"/>
           </w:tcPr>
           <w:p>
@@ -3668,8 +3713,14 @@
         </w:trPr>
         <w:tc>
           <w:tcPr>
-            <w:tcW w:w="1664" w:type="pct"/>
+            <w:tcW w:w="1507" w:type="pct"/>
             <w:gridSpan w:val="2"/>
+            <w:tcBorders>
+              <w:top w:val="single" w:sz="4" w:space="0" w:color="auto"/>
+              <w:left w:val="single" w:sz="4" w:space="0" w:color="auto"/>
+              <w:bottom w:val="single" w:sz="4" w:space="0" w:color="auto"/>
+              <w:right w:val="single" w:sz="4" w:space="0" w:color="000000"/>
+            </w:tcBorders>
             <w:vAlign w:val="center"/>
             <w:hideMark/>
           </w:tcPr>
@@ -3704,13 +3755,15 @@
         </w:tc>
         <w:tc>
           <w:tcPr>
-            <w:tcW w:w="1002" w:type="pct"/>
-            <w:gridSpan w:val="2"/>
+            <w:tcW w:w="755" w:type="pct"/>
             <w:tcBorders>
-              <w:top w:val="single" w:sz="4" w:space="0" w:color="auto"/>
+              <w:top w:val="nil"/>
+              <w:left w:val="nil"/>
+              <w:bottom w:val="single" w:sz="4" w:space="0" w:color="auto"/>
               <w:right w:val="single" w:sz="4" w:space="0" w:color="auto"/>
             </w:tcBorders>
             <w:vAlign w:val="center"/>
+            <w:hideMark/>
           </w:tcPr>
           <w:p>
             <w:pPr>
@@ -3729,26 +3782,26 @@
         </w:tc>
         <w:tc>
           <w:tcPr>
-            <w:tcW w:w="2334" w:type="pct"/>
-            <w:gridSpan w:val="2"/>
-            <w:vMerge w:val="restart"/>
+            <w:tcW w:w="2738" w:type="pct"/>
             <w:tcBorders>
-              <w:top w:val="single" w:sz="4" w:space="0" w:color="auto"/>
-              <w:left w:val="single" w:sz="4" w:space="0" w:color="auto"/>
+              <w:top w:val="nil"/>
+              <w:left w:val="nil"/>
+              <w:bottom w:val="single" w:sz="4" w:space="0" w:color="auto"/>
               <w:right w:val="single" w:sz="4" w:space="0" w:color="auto"/>
             </w:tcBorders>
             <w:vAlign w:val="center"/>
+            <w:hideMark/>
           </w:tcPr>
           <w:p>
             <w:pPr>
               <w:spacing w:after="0" w:line="240" w:lineRule="auto"/>
-              <w:ind w:firstLineChars="100" w:firstLine="240"/>
               <w:jc w:val="center"/>
               <w:rPr>
-                <w:rFonts w:ascii="Arial" w:hAnsi="Arial" w:cs="Arial"/>
+                <w:rFonts w:ascii="Arial" w:eastAsia="Times New Roman" w:hAnsi="Arial" w:cs="Arial"/>
+                <w:color w:val="000000"/>
                 <w:sz w:val="24"/>
                 <w:szCs w:val="24"/>
-                <w:lang w:val="en-US"/>
+                <w:lang w:eastAsia="en-SG"/>
               </w:rPr>
             </w:pPr>
           </w:p>
@@ -3760,10 +3813,13 @@
         </w:trPr>
         <w:tc>
           <w:tcPr>
-            <w:tcW w:w="1664" w:type="pct"/>
+            <w:tcW w:w="1507" w:type="pct"/>
             <w:gridSpan w:val="2"/>
             <w:tcBorders>
+              <w:top w:val="single" w:sz="4" w:space="0" w:color="auto"/>
+              <w:left w:val="single" w:sz="4" w:space="0" w:color="auto"/>
               <w:bottom w:val="single" w:sz="4" w:space="0" w:color="auto"/>
+              <w:right w:val="single" w:sz="4" w:space="0" w:color="000000"/>
             </w:tcBorders>
             <w:vAlign w:val="center"/>
             <w:hideMark/>
@@ -3799,36 +3855,10 @@
         </w:tc>
         <w:tc>
           <w:tcPr>
-            <w:tcW w:w="1002" w:type="pct"/>
-            <w:gridSpan w:val="2"/>
+            <w:tcW w:w="755" w:type="pct"/>
             <w:tcBorders>
-              <w:bottom w:val="single" w:sz="4" w:space="0" w:color="auto"/>
-              <w:right w:val="single" w:sz="4" w:space="0" w:color="auto"/>
-            </w:tcBorders>
-            <w:vAlign w:val="center"/>
-          </w:tcPr>
-          <w:p>
-            <w:pPr>
-              <w:spacing w:after="0" w:line="240" w:lineRule="auto"/>
-              <w:ind w:firstLineChars="100" w:firstLine="240"/>
-              <w:jc w:val="center"/>
-              <w:rPr>
-                <w:rFonts w:ascii="Arial" w:eastAsia="Times New Roman" w:hAnsi="Arial" w:cs="Arial"/>
-                <w:color w:val="000000"/>
-                <w:sz w:val="24"/>
-                <w:szCs w:val="24"/>
-                <w:lang w:eastAsia="en-SG"/>
-              </w:rPr>
-            </w:pPr>
-          </w:p>
-        </w:tc>
-        <w:tc>
-          <w:tcPr>
-            <w:tcW w:w="2334" w:type="pct"/>
-            <w:gridSpan w:val="2"/>
-            <w:vMerge/>
-            <w:tcBorders>
-              <w:left w:val="single" w:sz="4" w:space="0" w:color="auto"/>
+              <w:top w:val="nil"/>
+              <w:left w:val="nil"/>
               <w:bottom w:val="single" w:sz="4" w:space="0" w:color="auto"/>
               <w:right w:val="single" w:sz="4" w:space="0" w:color="auto"/>
             </w:tcBorders>
@@ -3839,7 +3869,33 @@
             <w:pPr>
               <w:spacing w:after="0" w:line="240" w:lineRule="auto"/>
               <w:ind w:firstLineChars="100" w:firstLine="240"/>
-              <w:jc w:val="right"/>
+              <w:jc w:val="center"/>
+              <w:rPr>
+                <w:rFonts w:ascii="Arial" w:eastAsia="Times New Roman" w:hAnsi="Arial" w:cs="Arial"/>
+                <w:color w:val="000000"/>
+                <w:sz w:val="24"/>
+                <w:szCs w:val="24"/>
+                <w:lang w:eastAsia="en-SG"/>
+              </w:rPr>
+            </w:pPr>
+          </w:p>
+        </w:tc>
+        <w:tc>
+          <w:tcPr>
+            <w:tcW w:w="2738" w:type="pct"/>
+            <w:tcBorders>
+              <w:top w:val="nil"/>
+              <w:left w:val="nil"/>
+              <w:bottom w:val="single" w:sz="4" w:space="0" w:color="auto"/>
+              <w:right w:val="single" w:sz="4" w:space="0" w:color="auto"/>
+            </w:tcBorders>
+            <w:vAlign w:val="center"/>
+            <w:hideMark/>
+          </w:tcPr>
+          <w:p>
+            <w:pPr>
+              <w:spacing w:after="0" w:line="240" w:lineRule="auto"/>
+              <w:jc w:val="center"/>
               <w:rPr>
                 <w:rFonts w:ascii="Arial" w:eastAsia="Times New Roman" w:hAnsi="Arial" w:cs="Arial"/>
                 <w:color w:val="000000"/>

</xml_diff>